<commit_message>
added file sla 4
</commit_message>
<xml_diff>
--- a/SLE_3_MAZE_Architecture/SLE3_25UAM041_Aditipise.docx
+++ b/SLE_3_MAZE_Architecture/SLE3_25UAM041_Aditipise.docx
@@ -43,10 +43,7 @@
         <w:t>PRN</w:t>
       </w:r>
       <w:r>
-        <w:t>: 25UAM0</w:t>
-      </w:r>
-      <w:r>
-        <w:t>41</w:t>
+        <w:t>: 25UAM041</w:t>
       </w:r>
     </w:p>
     <w:p>
@@ -97,6 +94,22 @@
       </w:r>
       <w:r>
         <w:t>/09/2026</w:t>
+      </w:r>
+    </w:p>
+    <w:p>
+      <w:r>
+        <w:t xml:space="preserve">GitHub </w:t>
+      </w:r>
+      <w:proofErr w:type="gramStart"/>
+      <w:r>
+        <w:t>Link :</w:t>
+      </w:r>
+      <w:proofErr w:type="gramEnd"/>
+      <w:r>
+        <w:t xml:space="preserve"> </w:t>
+      </w:r>
+      <w:r>
+        <w:t>https://github.com/aditipise2007-oss</w:t>
       </w:r>
     </w:p>
     <w:p/>
@@ -122,16 +135,7 @@
           <w:sz w:val="32"/>
           <w:szCs w:val="32"/>
         </w:rPr>
-        <w:t>System Title &amp; Short Description</w:t>
-      </w:r>
-      <w:r>
-        <w:rPr>
-          <w:b/>
-          <w:bCs/>
-          <w:sz w:val="32"/>
-          <w:szCs w:val="32"/>
-        </w:rPr>
-        <w:t>:</w:t>
+        <w:t>System Title &amp; Short Description:</w:t>
       </w:r>
     </w:p>
     <w:p>
@@ -782,16 +786,7 @@
           <w:sz w:val="32"/>
           <w:szCs w:val="32"/>
         </w:rPr>
-        <w:t>)</w:t>
-      </w:r>
-      <w:r>
-        <w:rPr>
-          <w:b/>
-          <w:bCs/>
-          <w:sz w:val="32"/>
-          <w:szCs w:val="32"/>
-        </w:rPr>
-        <w:t xml:space="preserve"> :</w:t>
+        <w:t>) :</w:t>
       </w:r>
       <w:proofErr w:type="gramEnd"/>
     </w:p>
@@ -1040,16 +1035,7 @@
           <w:sz w:val="32"/>
           <w:szCs w:val="32"/>
         </w:rPr>
-        <w:t>Decisions</w:t>
-      </w:r>
-      <w:r>
-        <w:rPr>
-          <w:b/>
-          <w:bCs/>
-          <w:sz w:val="32"/>
-          <w:szCs w:val="32"/>
-        </w:rPr>
-        <w:t xml:space="preserve"> :</w:t>
+        <w:t>Decisions :</w:t>
       </w:r>
       <w:proofErr w:type="gramEnd"/>
     </w:p>
@@ -2372,6 +2358,7 @@
   <w:style w:type="character" w:default="1" w:styleId="DefaultParagraphFont">
     <w:name w:val="Default Paragraph Font"/>
     <w:uiPriority w:val="1"/>
+    <w:semiHidden/>
     <w:unhideWhenUsed/>
   </w:style>
   <w:style w:type="table" w:default="1" w:styleId="TableNormal">

</xml_diff>